<commit_message>
Menu plein écran avec sa croix, survol des liens, couleurs TPE/PME, cartes sans filets
- Menu : l'en-tête s'efface quand il s'ouvre ; le menu porte sa propre
  croix (en haut à droite, focus à l'ouverture) et son contenu se répartit
  sur toute la hauteur (espaces en haut, boutons en bas).
- Liens : plus aucun soulignement au repos. Au survol, un trait se dessine
  de gauche à droite puis un fond léger monte derrière le texte, sur fond
  clair comme sur indigo, dans les deux espaces.
- Espace TPE/PME : bandes de couleur à bords arrondis, avec la trame sur
  les bords (menthe pour les TPE, ciel pour les PME, soleil pour le client
  idéal), comme dans l'espace « en projet ».
- Cartes de visite : plus de filets horizontaux, adresse reskope.fr
  (site, carte virtuelle, PDF d'impression régénérés), document de
  direction artistique mis à jour.

Co-Authored-By: Claude Opus 5.5 <noreply@anthropic.com>
</commit_message>
<xml_diff>
--- a/Impression/Reskope - Direction artistique.docx
+++ b/Impression/Reskope - Direction artistique.docx
@@ -2229,7 +2229,7 @@
       <w:r>
         <w:drawing>
           <wp:inline distT="0" distB="0" distL="0" distR="0">
-            <wp:extent cx="5940000" cy="1809843"/>
+            <wp:extent cx="5940000" cy="1804042"/>
             <wp:docPr id="8" name="Image 8"/>
             <wp:cNvGraphicFramePr>
               <a:graphicFrameLocks noChangeAspect="1"/>
@@ -2250,7 +2250,7 @@
                   <pic:spPr>
                     <a:xfrm>
                       <a:off x="0" y="0"/>
-                      <a:ext cx="5940000" cy="1809843"/>
+                      <a:ext cx="5940000" cy="1804042"/>
                     </a:xfrm>
                     <a:prstGeom prst="rect">
                       <a:avLst/>
@@ -2346,10 +2346,10 @@
         <w:rPr>
           <w:b/>
         </w:rPr>
-        <w:t xml:space="preserve">Au survol :</w:t>
-      </w:r>
-      <w:r>
-        <w:t xml:space="preserve"> les liens se surlignent, les flèches avancent, les cartes s’inclinent en volume sous la souris.</w:t>
+        <w:t xml:space="preserve">Les liens :</w:t>
+      </w:r>
+      <w:r>
+        <w:t xml:space="preserve"> aucun soulignement au repos. Au survol, un trait se dessine de gauche à droite, puis un fond léger monte derrière le texte ; les flèches avancent, les cartes s’inclinent en volume sous la souris.</w:t>
       </w:r>
     </w:p>
     <w:p>
@@ -2503,10 +2503,10 @@
         <w:rPr>
           <w:b/>
         </w:rPr>
-        <w:t xml:space="preserve">Le menu tient dans un écran,</w:t>
-      </w:r>
-      <w:r>
-        <w:t xml:space="preserve"> sur téléphone comme sur ordinateur, avec une croix pour le fermer.</w:t>
+        <w:t xml:space="preserve">Le menu occupe tout l’écran,</w:t>
+      </w:r>
+      <w:r>
+        <w:t xml:space="preserve"> de haut en bas, sur téléphone comme sur ordinateur : l’en-tête s’efface quand il s’ouvre, et le menu porte sa propre croix.</w:t>
       </w:r>
     </w:p>
     <w:p>
@@ -2517,7 +2517,7 @@
       <w:r>
         <w:drawing>
           <wp:inline distT="0" distB="0" distL="0" distR="0">
-            <wp:extent cx="5940000" cy="4200428"/>
+            <wp:extent cx="5940000" cy="4141028"/>
             <wp:docPr id="9" name="Image 9"/>
             <wp:cNvGraphicFramePr>
               <a:graphicFrameLocks noChangeAspect="1"/>
@@ -2538,7 +2538,7 @@
                   <pic:spPr>
                     <a:xfrm>
                       <a:off x="0" y="0"/>
-                      <a:ext cx="5940000" cy="4200428"/>
+                      <a:ext cx="5940000" cy="4141028"/>
                     </a:xfrm>
                     <a:prstGeom prst="rect">
                       <a:avLst/>
@@ -2608,7 +2608,7 @@
         <w:jc w:val="center"/>
       </w:pPr>
       <w:r>
-        <w:t xml:space="preserve">Le menu : les trois espaces en tuiles, les missions, les pages.</w:t>
+        <w:t xml:space="preserve">Le menu : sa croix, les trois espaces en tuiles, les missions, les pages, sur toute la hauteur.</w:t>
       </w:r>
     </w:p>
     <w:p>
@@ -3006,7 +3006,7 @@
     </w:p>
     <w:p>
       <w:r>
-        <w:t xml:space="preserve">85 × 55 mm, recto indigo (le nom, ce que la personne mène, ses coordonnées), verso crème (le R et la phrase de marque). Fichiers prêts pour l’imprimeur dans « Impression / Cartes de visite ».</w:t>
+        <w:t xml:space="preserve">85 × 55 mm, recto indigo (le nom, ce que la personne mène, ses coordonnées), verso crème (le R et la phrase de marque), sans filet horizontal, avec l’adresse reskope.fr. Fichiers prêts pour l’imprimeur dans « Impression / Cartes de visite ».</w:t>
       </w:r>
     </w:p>
     <w:tbl>
@@ -3423,7 +3423,19 @@
         </w:numPr>
       </w:pPr>
       <w:r>
-        <w:t xml:space="preserve">Souligner quelque chose qui ne se clique pas, ou laisser un lien sans réaction au survol.</w:t>
+        <w:t xml:space="preserve">Souligner un texte par défaut, ou laisser un lien sans réaction au survol.</w:t>
+      </w:r>
+    </w:p>
+    <w:p>
+      <w:pPr>
+        <w:pStyle w:val="Puce"/>
+        <w:numPr>
+          <w:ilvl w:val="0"/>
+          <w:numId w:val="1"/>
+        </w:numPr>
+      </w:pPr>
+      <w:r>
+        <w:t xml:space="preserve">Tracer des filets horizontaux pour séparer : l’espace et les bandes suffisent.</w:t>
       </w:r>
     </w:p>
     <w:sectPr>

</xml_diff>

<commit_message>
Logo aux vraies proportions partout, croix en réseau, image de partage
- Le R de la carte de visite avait des traits épaissis : cartes du site,
  carte virtuelle, PDF d'impression et document de DA reprennent le logo
  exact (traits 3, nœuds 5,5, jonction 7) et le logo horizontal de l'en-tête.
- scripts/logo.py refait tous les fichiers du logo depuis une seule
  géométrie ; le logo horizontal ne coupe plus le haut du mot.
- La carte téléchargée embarque la police de la marque.
- Une croix de fermeture en réseau (CroixReseau) pour le menu, la carte
  et l'explorateur, qui se construit à l'ouverture du menu.
- Plus aucun filet horizontal ni lien souligné au repos.
- Nouvelle image de partage (og-image) et icône d'onglet fidèle au logo.

Co-Authored-By: Claude Opus 5.5 <noreply@anthropic.com>
</commit_message>
<xml_diff>
--- a/Impression/Reskope - Direction artistique.docx
+++ b/Impression/Reskope - Direction artistique.docx
@@ -64,7 +64,7 @@
         <w:jc w:val="center"/>
       </w:pPr>
       <w:r>
-        <w:t xml:space="preserve">Reskope · version du 26 septembre 2026</w:t>
+        <w:t xml:space="preserve">Reskope · version du 27 septembre 2026</w:t>
       </w:r>
     </w:p>
     <w:p>
@@ -392,111 +392,13 @@
     </w:p>
     <w:p>
       <w:pPr>
-        <w:pStyle w:val="Titre2"/>
-      </w:pPr>
-      <w:r>
-        <w:t xml:space="preserve">Les règles</w:t>
-      </w:r>
-    </w:p>
-    <w:p>
-      <w:pPr>
-        <w:pStyle w:val="Puce"/>
-        <w:numPr>
-          <w:ilvl w:val="0"/>
-          <w:numId w:val="1"/>
-        </w:numPr>
-      </w:pPr>
-      <w:r>
-        <w:rPr>
-          <w:b/>
-        </w:rPr>
-        <w:t xml:space="preserve">Zone de protection :</w:t>
-      </w:r>
-      <w:r>
-        <w:t xml:space="preserve"> un espace libre égal à la moitié de la hauteur du R, tout autour.</w:t>
-      </w:r>
-    </w:p>
-    <w:p>
-      <w:pPr>
-        <w:pStyle w:val="Puce"/>
-        <w:numPr>
-          <w:ilvl w:val="0"/>
-          <w:numId w:val="1"/>
-        </w:numPr>
-      </w:pPr>
-      <w:r>
-        <w:rPr>
-          <w:b/>
-        </w:rPr>
-        <w:t xml:space="preserve">Taille minimale :</w:t>
-      </w:r>
-      <w:r>
-        <w:t xml:space="preserve"> le R seul, 24 px à l’écran et 6 mm à l’impression ; avec le nom, 90 px et 22 mm.</w:t>
-      </w:r>
-    </w:p>
-    <w:p>
-      <w:pPr>
-        <w:pStyle w:val="Puce"/>
-        <w:numPr>
-          <w:ilvl w:val="0"/>
-          <w:numId w:val="1"/>
-        </w:numPr>
-      </w:pPr>
-      <w:r>
-        <w:rPr>
-          <w:b/>
-        </w:rPr>
-        <w:t xml:space="preserve">Sur téléphone,</w:t>
-      </w:r>
-      <w:r>
-        <w:t xml:space="preserve"> le R porte seul la marque dans l’en-tête : il y est plus grand (34 px).</w:t>
-      </w:r>
-    </w:p>
-    <w:p>
-      <w:pPr>
-        <w:pStyle w:val="Puce"/>
-        <w:numPr>
-          <w:ilvl w:val="0"/>
-          <w:numId w:val="1"/>
-        </w:numPr>
-      </w:pPr>
-      <w:r>
-        <w:rPr>
-          <w:b/>
-        </w:rPr>
-        <w:t xml:space="preserve">Jamais :</w:t>
-      </w:r>
-      <w:r>
-        <w:t xml:space="preserve"> déformé, incliné, ombré, en dégradé, dans une autre couleur que l’indigo, le crème ou l’encre, ni posé sur une photo chargée.</w:t>
-      </w:r>
-    </w:p>
-    <w:p>
-      <w:r>
-        <w:br w:type="page"/>
-      </w:r>
-    </w:p>
-    <w:p>
-      <w:pPr>
-        <w:pStyle w:val="Titre1"/>
-      </w:pPr>
-      <w:r>
-        <w:t xml:space="preserve">Les couleurs</w:t>
-      </w:r>
-    </w:p>
-    <w:p>
-      <w:r>
-        <w:t xml:space="preserve">La marque reste bleue et blanche : l’indigo et le crème. Pour expliquer, cinq couleurs de plus ; chacune dit une chose, dans les schémas, et chaque espace du site en porte une en accent.</w:t>
-      </w:r>
-    </w:p>
-    <w:p>
-      <w:pPr>
         <w:spacing w:before="120" w:after="200"/>
         <w:jc w:val="center"/>
       </w:pPr>
       <w:r>
         <w:drawing>
           <wp:inline distT="0" distB="0" distL="0" distR="0">
-            <wp:extent cx="5940000" cy="2663100"/>
+            <wp:extent cx="5940000" cy="2574000"/>
             <wp:docPr id="4" name="Image 4"/>
             <wp:cNvGraphicFramePr>
               <a:graphicFrameLocks noChangeAspect="1"/>
@@ -510,6 +412,227 @@
                   </pic:nvPicPr>
                   <pic:blipFill>
                     <a:blip r:embed="rIdImg4"/>
+                    <a:stretch>
+                      <a:fillRect/>
+                    </a:stretch>
+                  </pic:blipFill>
+                  <pic:spPr>
+                    <a:xfrm>
+                      <a:off x="0" y="0"/>
+                      <a:ext cx="5940000" cy="2574000"/>
+                    </a:xfrm>
+                    <a:prstGeom prst="rect">
+                      <a:avLst/>
+                    </a:prstGeom>
+                  </pic:spPr>
+                </pic:pic>
+              </a:graphicData>
+            </a:graphic>
+          </wp:inline>
+        </w:drawing>
+      </w:r>
+    </w:p>
+    <w:p>
+      <w:pPr>
+        <w:pStyle w:val="Legende"/>
+        <w:jc w:val="center"/>
+      </w:pPr>
+      <w:r>
+        <w:t xml:space="preserve">La construction du R et du logo horizontal.</w:t>
+      </w:r>
+    </w:p>
+    <w:p>
+      <w:pPr>
+        <w:pStyle w:val="Titre2"/>
+      </w:pPr>
+      <w:r>
+        <w:t xml:space="preserve">Les règles</w:t>
+      </w:r>
+    </w:p>
+    <w:p>
+      <w:pPr>
+        <w:pStyle w:val="Puce"/>
+        <w:numPr>
+          <w:ilvl w:val="0"/>
+          <w:numId w:val="1"/>
+        </w:numPr>
+      </w:pPr>
+      <w:r>
+        <w:rPr>
+          <w:b/>
+        </w:rPr>
+        <w:t xml:space="preserve">Les proportions du R ne changent jamais :</w:t>
+      </w:r>
+      <w:r>
+        <w:t xml:space="preserve"> pour un R de 92 de haut (du nœud du haut au nœud du bas), des traits de 3, des nœuds de 5,5 de rayon, une jonction de 7. On l’agrandit ou on le réduit, on n’épaissit jamais ses traits.</w:t>
+      </w:r>
+    </w:p>
+    <w:p>
+      <w:pPr>
+        <w:pStyle w:val="Puce"/>
+        <w:numPr>
+          <w:ilvl w:val="0"/>
+          <w:numId w:val="1"/>
+        </w:numPr>
+      </w:pPr>
+      <w:r>
+        <w:rPr>
+          <w:b/>
+        </w:rPr>
+        <w:t xml:space="preserve">Le logo horizontal suit l’en-tête du site :</w:t>
+      </w:r>
+      <w:r>
+        <w:t xml:space="preserve"> le R fait 1,2 fois la hauteur des capitales du nom, il est centré sur elles, et le nom commence à une hauteur de capitale de ses nœuds de droite.</w:t>
+      </w:r>
+    </w:p>
+    <w:p>
+      <w:pPr>
+        <w:pStyle w:val="Puce"/>
+        <w:numPr>
+          <w:ilvl w:val="0"/>
+          <w:numId w:val="1"/>
+        </w:numPr>
+      </w:pPr>
+      <w:r>
+        <w:rPr>
+          <w:b/>
+        </w:rPr>
+        <w:t xml:space="preserve">Les fichiers</w:t>
+      </w:r>
+      <w:r>
+        <w:t xml:space="preserve"> (le R seul, le logo horizontal, le nom seul, en indigo, crème et encre) sont dans le dossier « logo » du site, texte vectorisé : ils s’ouvrent partout, même sans la police.</w:t>
+      </w:r>
+    </w:p>
+    <w:p>
+      <w:pPr>
+        <w:pStyle w:val="Puce"/>
+        <w:numPr>
+          <w:ilvl w:val="0"/>
+          <w:numId w:val="1"/>
+        </w:numPr>
+      </w:pPr>
+      <w:r>
+        <w:rPr>
+          <w:b/>
+        </w:rPr>
+        <w:t xml:space="preserve">L’icône d’onglet</w:t>
+      </w:r>
+      <w:r>
+        <w:t xml:space="preserve"> reprend le R crème sur un carré indigo arrondi ; seule entorse, ses traits sont un peu renforcés pour rester lisibles à 16 pixels.</w:t>
+      </w:r>
+    </w:p>
+    <w:p>
+      <w:pPr>
+        <w:pStyle w:val="Puce"/>
+        <w:numPr>
+          <w:ilvl w:val="0"/>
+          <w:numId w:val="1"/>
+        </w:numPr>
+      </w:pPr>
+      <w:r>
+        <w:rPr>
+          <w:b/>
+        </w:rPr>
+        <w:t xml:space="preserve">Zone de protection :</w:t>
+      </w:r>
+      <w:r>
+        <w:t xml:space="preserve"> un espace libre égal à la moitié de la hauteur du R, tout autour.</w:t>
+      </w:r>
+    </w:p>
+    <w:p>
+      <w:pPr>
+        <w:pStyle w:val="Puce"/>
+        <w:numPr>
+          <w:ilvl w:val="0"/>
+          <w:numId w:val="1"/>
+        </w:numPr>
+      </w:pPr>
+      <w:r>
+        <w:rPr>
+          <w:b/>
+        </w:rPr>
+        <w:t xml:space="preserve">Taille minimale :</w:t>
+      </w:r>
+      <w:r>
+        <w:t xml:space="preserve"> le R seul, 24 px à l’écran et 6 mm à l’impression ; avec le nom, 90 px et 22 mm.</w:t>
+      </w:r>
+    </w:p>
+    <w:p>
+      <w:pPr>
+        <w:pStyle w:val="Puce"/>
+        <w:numPr>
+          <w:ilvl w:val="0"/>
+          <w:numId w:val="1"/>
+        </w:numPr>
+      </w:pPr>
+      <w:r>
+        <w:rPr>
+          <w:b/>
+        </w:rPr>
+        <w:t xml:space="preserve">Sur téléphone,</w:t>
+      </w:r>
+      <w:r>
+        <w:t xml:space="preserve"> le R porte seul la marque dans l’en-tête : il y est plus grand (34 px).</w:t>
+      </w:r>
+    </w:p>
+    <w:p>
+      <w:pPr>
+        <w:pStyle w:val="Puce"/>
+        <w:numPr>
+          <w:ilvl w:val="0"/>
+          <w:numId w:val="1"/>
+        </w:numPr>
+      </w:pPr>
+      <w:r>
+        <w:rPr>
+          <w:b/>
+        </w:rPr>
+        <w:t xml:space="preserve">Jamais :</w:t>
+      </w:r>
+      <w:r>
+        <w:t xml:space="preserve"> déformé, incliné, ombré, en dégradé, dans une autre couleur que l’indigo, le crème ou l’encre, ni posé sur une photo chargée.</w:t>
+      </w:r>
+    </w:p>
+    <w:p>
+      <w:r>
+        <w:br w:type="page"/>
+      </w:r>
+    </w:p>
+    <w:p>
+      <w:pPr>
+        <w:pStyle w:val="Titre1"/>
+      </w:pPr>
+      <w:r>
+        <w:t xml:space="preserve">Les couleurs</w:t>
+      </w:r>
+    </w:p>
+    <w:p>
+      <w:r>
+        <w:t xml:space="preserve">La marque reste bleue et blanche : l’indigo et le crème. Pour expliquer, cinq couleurs de plus ; chacune dit une chose, dans les schémas, et chaque espace du site en porte une en accent.</w:t>
+      </w:r>
+    </w:p>
+    <w:p>
+      <w:pPr>
+        <w:spacing w:before="120" w:after="200"/>
+        <w:jc w:val="center"/>
+      </w:pPr>
+      <w:r>
+        <w:drawing>
+          <wp:inline distT="0" distB="0" distL="0" distR="0">
+            <wp:extent cx="5940000" cy="2663100"/>
+            <wp:docPr id="5" name="Image 5"/>
+            <wp:cNvGraphicFramePr>
+              <a:graphicFrameLocks noChangeAspect="1"/>
+            </wp:cNvGraphicFramePr>
+            <a:graphic>
+              <a:graphicData uri="http://schemas.openxmlformats.org/drawingml/2006/picture">
+                <pic:pic>
+                  <pic:nvPicPr>
+                    <pic:cNvPr id="5" name="image5.png"/>
+                    <pic:cNvPicPr/>
+                  </pic:nvPicPr>
+                  <pic:blipFill>
+                    <a:blip r:embed="rIdImg5"/>
                     <a:stretch>
                       <a:fillRect/>
                     </a:stretch>
@@ -1909,207 +2032,6 @@
         <w:drawing>
           <wp:inline distT="0" distB="0" distL="0" distR="0">
             <wp:extent cx="5940000" cy="2509650"/>
-            <wp:docPr id="5" name="Image 5"/>
-            <wp:cNvGraphicFramePr>
-              <a:graphicFrameLocks noChangeAspect="1"/>
-            </wp:cNvGraphicFramePr>
-            <a:graphic>
-              <a:graphicData uri="http://schemas.openxmlformats.org/drawingml/2006/picture">
-                <pic:pic>
-                  <pic:nvPicPr>
-                    <pic:cNvPr id="5" name="image5.png"/>
-                    <pic:cNvPicPr/>
-                  </pic:nvPicPr>
-                  <pic:blipFill>
-                    <a:blip r:embed="rIdImg5"/>
-                    <a:stretch>
-                      <a:fillRect/>
-                    </a:stretch>
-                  </pic:blipFill>
-                  <pic:spPr>
-                    <a:xfrm>
-                      <a:off x="0" y="0"/>
-                      <a:ext cx="5940000" cy="2509650"/>
-                    </a:xfrm>
-                    <a:prstGeom prst="rect">
-                      <a:avLst/>
-                    </a:prstGeom>
-                  </pic:spPr>
-                </pic:pic>
-              </a:graphicData>
-            </a:graphic>
-          </wp:inline>
-        </w:drawing>
-      </w:r>
-    </w:p>
-    <w:p>
-      <w:pPr>
-        <w:pStyle w:val="Puce"/>
-        <w:numPr>
-          <w:ilvl w:val="0"/>
-          <w:numId w:val="1"/>
-        </w:numPr>
-      </w:pPr>
-      <w:r>
-        <w:rPr>
-          <w:b/>
-        </w:rPr>
-        <w:t xml:space="preserve">Neue Einstellung</w:t>
-      </w:r>
-      <w:r>
-        <w:t xml:space="preserve"> pour tout le texte : Regular 400 pour lire, Medium 500 pour les liens et les étiquettes, SemiBold 600 pour les titres.</w:t>
-      </w:r>
-    </w:p>
-    <w:p>
-      <w:pPr>
-        <w:pStyle w:val="Puce"/>
-        <w:numPr>
-          <w:ilvl w:val="0"/>
-          <w:numId w:val="1"/>
-        </w:numPr>
-      </w:pPr>
-      <w:r>
-        <w:rPr>
-          <w:b/>
-        </w:rPr>
-        <w:t xml:space="preserve">Reskope Network</w:t>
-      </w:r>
-      <w:r>
-        <w:t xml:space="preserve">, la police dessinée en réseau, pour le nom de la marque et quelques grands mots : jamais pour du texte courant.</w:t>
-      </w:r>
-    </w:p>
-    <w:p>
-      <w:pPr>
-        <w:pStyle w:val="Puce"/>
-        <w:numPr>
-          <w:ilvl w:val="0"/>
-          <w:numId w:val="1"/>
-        </w:numPr>
-      </w:pPr>
-      <w:r>
-        <w:rPr>
-          <w:b/>
-        </w:rPr>
-        <w:t xml:space="preserve">Échelle du site :</w:t>
-      </w:r>
-      <w:r>
-        <w:t xml:space="preserve"> titre de page 2,3 à 4,8 rem ; titre de section 1,75 à 3 rem ; texte 1 à 1,12 rem ; interligne 1,6 à 1,7 ; 60 à 70 signes par ligne.</w:t>
-      </w:r>
-    </w:p>
-    <w:p>
-      <w:pPr>
-        <w:pStyle w:val="Puce"/>
-        <w:numPr>
-          <w:ilvl w:val="0"/>
-          <w:numId w:val="1"/>
-        </w:numPr>
-      </w:pPr>
-      <w:r>
-        <w:rPr>
-          <w:b/>
-        </w:rPr>
-        <w:t xml:space="preserve">Écriture :</w:t>
-      </w:r>
-      <w:r>
-        <w:t xml:space="preserve"> espace insécable avant « : ; ! ? » et dans les guillemets français ; pas de tiret cadratin ; pas de petites capitales espacées au-dessus des titres ; « vous » pour le lecteur, « on » pour Reskope.</w:t>
-      </w:r>
-    </w:p>
-    <w:p>
-      <w:pPr>
-        <w:pStyle w:val="Encadre"/>
-        <w:shd w:val="clear" w:color="auto" w:fill="FBEBD1"/>
-      </w:pPr>
-      <w:r>
-        <w:rPr>
-          <w:b/>
-        </w:rPr>
-        <w:t xml:space="preserve">À venir :</w:t>
-      </w:r>
-      <w:r>
-        <w:t xml:space="preserve"> une typographie maison, « Reskope ». La police Neue Einstellung n’est pas à nous ; la nôtre la remplacera partout, sur le site comme sur les supports.</w:t>
-      </w:r>
-    </w:p>
-    <w:p>
-      <w:r>
-        <w:br w:type="page"/>
-      </w:r>
-    </w:p>
-    <w:p>
-      <w:pPr>
-        <w:pStyle w:val="Titre1"/>
-      </w:pPr>
-      <w:r>
-        <w:t xml:space="preserve">Le réseau</w:t>
-      </w:r>
-    </w:p>
-    <w:p>
-      <w:r>
-        <w:t xml:space="preserve">Le réseau est la langue de la marque. Un nœud, c’est une chose ; un lien, une relation ; une couleur, une catégorie. Il a trois usages.</w:t>
-      </w:r>
-    </w:p>
-    <w:p>
-      <w:pPr>
-        <w:pStyle w:val="Puce"/>
-        <w:numPr>
-          <w:ilvl w:val="0"/>
-          <w:numId w:val="1"/>
-        </w:numPr>
-      </w:pPr>
-      <w:r>
-        <w:rPr>
-          <w:b/>
-        </w:rPr>
-        <w:t xml:space="preserve">La trame :</w:t>
-      </w:r>
-      <w:r>
-        <w:t xml:space="preserve"> en fond, très légère, peu dense ; elle reste sur les bords des bandes et ne passe jamais derrière un texte à lire. La souris l’attire, jamais un doigt.</w:t>
-      </w:r>
-    </w:p>
-    <w:p>
-      <w:pPr>
-        <w:pStyle w:val="Puce"/>
-        <w:numPr>
-          <w:ilvl w:val="0"/>
-          <w:numId w:val="1"/>
-        </w:numPr>
-      </w:pPr>
-      <w:r>
-        <w:rPr>
-          <w:b/>
-        </w:rPr>
-        <w:t xml:space="preserve">Les schémas :</w:t>
-      </w:r>
-      <w:r>
-        <w:t xml:space="preserve"> le réseau porte l’information, par exemple la taille d’une entreprise (un nœud, sept, vingt-six), le client idéal et ses centres d’intérêt, le business plan et ses cinq parties.</w:t>
-      </w:r>
-    </w:p>
-    <w:p>
-      <w:pPr>
-        <w:pStyle w:val="Puce"/>
-        <w:numPr>
-          <w:ilvl w:val="0"/>
-          <w:numId w:val="1"/>
-        </w:numPr>
-      </w:pPr>
-      <w:r>
-        <w:rPr>
-          <w:b/>
-        </w:rPr>
-        <w:t xml:space="preserve">Le mot-symbole :</w:t>
-      </w:r>
-      <w:r>
-        <w:t xml:space="preserve"> le R, et « Reskope » écrit en police réseau.</w:t>
-      </w:r>
-    </w:p>
-    <w:p>
-      <w:pPr>
-        <w:spacing w:before="120" w:after="200"/>
-        <w:jc w:val="center"/>
-      </w:pPr>
-      <w:r>
-        <w:drawing>
-          <wp:inline distT="0" distB="0" distL="0" distR="0">
-            <wp:extent cx="5940000" cy="4445419"/>
             <wp:docPr id="6" name="Image 6"/>
             <wp:cNvGraphicFramePr>
               <a:graphicFrameLocks noChangeAspect="1"/>
@@ -2130,7 +2052,7 @@
                   <pic:spPr>
                     <a:xfrm>
                       <a:off x="0" y="0"/>
-                      <a:ext cx="5940000" cy="4445419"/>
+                      <a:ext cx="5940000" cy="2509650"/>
                     </a:xfrm>
                     <a:prstGeom prst="rect">
                       <a:avLst/>
@@ -2145,11 +2067,161 @@
     </w:p>
     <w:p>
       <w:pPr>
-        <w:pStyle w:val="Legende"/>
-        <w:jc w:val="center"/>
-      </w:pPr>
-      <w:r>
-        <w:t xml:space="preserve">L’entrée du site : trois tailles d’entreprise, dessinées en réseau.</w:t>
+        <w:pStyle w:val="Puce"/>
+        <w:numPr>
+          <w:ilvl w:val="0"/>
+          <w:numId w:val="1"/>
+        </w:numPr>
+      </w:pPr>
+      <w:r>
+        <w:rPr>
+          <w:b/>
+        </w:rPr>
+        <w:t xml:space="preserve">Neue Einstellung</w:t>
+      </w:r>
+      <w:r>
+        <w:t xml:space="preserve"> pour tout le texte : Regular 400 pour lire, Medium 500 pour les liens et les étiquettes, SemiBold 600 pour les titres.</w:t>
+      </w:r>
+    </w:p>
+    <w:p>
+      <w:pPr>
+        <w:pStyle w:val="Puce"/>
+        <w:numPr>
+          <w:ilvl w:val="0"/>
+          <w:numId w:val="1"/>
+        </w:numPr>
+      </w:pPr>
+      <w:r>
+        <w:rPr>
+          <w:b/>
+        </w:rPr>
+        <w:t xml:space="preserve">Reskope Network</w:t>
+      </w:r>
+      <w:r>
+        <w:t xml:space="preserve">, la police dessinée en réseau, pour le nom de la marque et quelques grands mots : jamais pour du texte courant.</w:t>
+      </w:r>
+    </w:p>
+    <w:p>
+      <w:pPr>
+        <w:pStyle w:val="Puce"/>
+        <w:numPr>
+          <w:ilvl w:val="0"/>
+          <w:numId w:val="1"/>
+        </w:numPr>
+      </w:pPr>
+      <w:r>
+        <w:rPr>
+          <w:b/>
+        </w:rPr>
+        <w:t xml:space="preserve">Échelle du site :</w:t>
+      </w:r>
+      <w:r>
+        <w:t xml:space="preserve"> titre de page 2,3 à 4,8 rem ; titre de section 1,75 à 3 rem ; texte 1 à 1,12 rem ; interligne 1,6 à 1,7 ; 60 à 70 signes par ligne.</w:t>
+      </w:r>
+    </w:p>
+    <w:p>
+      <w:pPr>
+        <w:pStyle w:val="Puce"/>
+        <w:numPr>
+          <w:ilvl w:val="0"/>
+          <w:numId w:val="1"/>
+        </w:numPr>
+      </w:pPr>
+      <w:r>
+        <w:rPr>
+          <w:b/>
+        </w:rPr>
+        <w:t xml:space="preserve">Écriture :</w:t>
+      </w:r>
+      <w:r>
+        <w:t xml:space="preserve"> espace insécable avant « : ; ! ? » et dans les guillemets français ; pas de tiret cadratin ; pas de petites capitales espacées au-dessus des titres ; « vous » pour le lecteur, « on » pour Reskope.</w:t>
+      </w:r>
+    </w:p>
+    <w:p>
+      <w:pPr>
+        <w:pStyle w:val="Encadre"/>
+        <w:shd w:val="clear" w:color="auto" w:fill="FBEBD1"/>
+      </w:pPr>
+      <w:r>
+        <w:rPr>
+          <w:b/>
+        </w:rPr>
+        <w:t xml:space="preserve">À venir :</w:t>
+      </w:r>
+      <w:r>
+        <w:t xml:space="preserve"> une typographie maison, « Reskope ». La police Neue Einstellung n’est pas à nous ; la nôtre la remplacera partout, sur le site comme sur les supports.</w:t>
+      </w:r>
+    </w:p>
+    <w:p>
+      <w:r>
+        <w:br w:type="page"/>
+      </w:r>
+    </w:p>
+    <w:p>
+      <w:pPr>
+        <w:pStyle w:val="Titre1"/>
+      </w:pPr>
+      <w:r>
+        <w:t xml:space="preserve">Le réseau</w:t>
+      </w:r>
+    </w:p>
+    <w:p>
+      <w:r>
+        <w:t xml:space="preserve">Le réseau est la langue de la marque. Un nœud, c’est une chose ; un lien, une relation ; une couleur, une catégorie. Il a trois usages.</w:t>
+      </w:r>
+    </w:p>
+    <w:p>
+      <w:pPr>
+        <w:pStyle w:val="Puce"/>
+        <w:numPr>
+          <w:ilvl w:val="0"/>
+          <w:numId w:val="1"/>
+        </w:numPr>
+      </w:pPr>
+      <w:r>
+        <w:rPr>
+          <w:b/>
+        </w:rPr>
+        <w:t xml:space="preserve">La trame :</w:t>
+      </w:r>
+      <w:r>
+        <w:t xml:space="preserve"> en fond, très légère, peu dense ; elle reste sur les bords des bandes et ne passe jamais derrière un texte à lire. La souris l’attire, jamais un doigt.</w:t>
+      </w:r>
+    </w:p>
+    <w:p>
+      <w:pPr>
+        <w:pStyle w:val="Puce"/>
+        <w:numPr>
+          <w:ilvl w:val="0"/>
+          <w:numId w:val="1"/>
+        </w:numPr>
+      </w:pPr>
+      <w:r>
+        <w:rPr>
+          <w:b/>
+        </w:rPr>
+        <w:t xml:space="preserve">Les schémas :</w:t>
+      </w:r>
+      <w:r>
+        <w:t xml:space="preserve"> le réseau porte l’information, par exemple la taille d’une entreprise (un nœud, sept, vingt-six), le client idéal et ses centres d’intérêt, le business plan et ses cinq parties.</w:t>
+      </w:r>
+    </w:p>
+    <w:p>
+      <w:pPr>
+        <w:pStyle w:val="Puce"/>
+        <w:numPr>
+          <w:ilvl w:val="0"/>
+          <w:numId w:val="1"/>
+        </w:numPr>
+      </w:pPr>
+      <w:r>
+        <w:rPr>
+          <w:b/>
+        </w:rPr>
+        <w:t xml:space="preserve">Le mot-symbole :</w:t>
+      </w:r>
+      <w:r>
+        <w:t xml:space="preserve"> le R, et « Reskope » écrit en police réseau.</w:t>
       </w:r>
     </w:p>
     <w:p>
@@ -2160,7 +2232,7 @@
       <w:r>
         <w:drawing>
           <wp:inline distT="0" distB="0" distL="0" distR="0">
-            <wp:extent cx="5940000" cy="7448738"/>
+            <wp:extent cx="5940000" cy="4445419"/>
             <wp:docPr id="7" name="Image 7"/>
             <wp:cNvGraphicFramePr>
               <a:graphicFrameLocks noChangeAspect="1"/>
@@ -2181,7 +2253,7 @@
                   <pic:spPr>
                     <a:xfrm>
                       <a:off x="0" y="0"/>
-                      <a:ext cx="5940000" cy="7448738"/>
+                      <a:ext cx="5940000" cy="4445419"/>
                     </a:xfrm>
                     <a:prstGeom prst="rect">
                       <a:avLst/>
@@ -2200,25 +2272,7 @@
         <w:jc w:val="center"/>
       </w:pPr>
       <w:r>
-        <w:t xml:space="preserve">Le livrable « votre client idéal » : ses centres d’intérêt en constellation, sa journée en réseau.</w:t>
-      </w:r>
-    </w:p>
-    <w:p>
-      <w:r>
-        <w:br w:type="page"/>
-      </w:r>
-    </w:p>
-    <w:p>
-      <w:pPr>
-        <w:pStyle w:val="Titre1"/>
-      </w:pPr>
-      <w:r>
-        <w:t xml:space="preserve">Les volumes</w:t>
-      </w:r>
-    </w:p>
-    <w:p>
-      <w:r>
-        <w:t xml:space="preserve">Les chiffres et les étapes se posent en volume, en axonométrie à 30°, comme sur une maquette. Trois faces d’indigo : dessus #5B4BE6, droite #1C0CB3, gauche #130982. Un volume plein, c’est vérifié ; en fil de fer, pas encore. Les couleurs d’explication s’y posent quand elles portent un sens : ce que ça évite en corail, ce que ça rapporte en menthe.</w:t>
+        <w:t xml:space="preserve">L’entrée du site : trois tailles d’entreprise, dessinées en réseau.</w:t>
       </w:r>
     </w:p>
     <w:p>
@@ -2229,7 +2283,7 @@
       <w:r>
         <w:drawing>
           <wp:inline distT="0" distB="0" distL="0" distR="0">
-            <wp:extent cx="5940000" cy="1804042"/>
+            <wp:extent cx="5940000" cy="7448738"/>
             <wp:docPr id="8" name="Image 8"/>
             <wp:cNvGraphicFramePr>
               <a:graphicFrameLocks noChangeAspect="1"/>
@@ -2250,7 +2304,7 @@
                   <pic:spPr>
                     <a:xfrm>
                       <a:off x="0" y="0"/>
-                      <a:ext cx="5940000" cy="1804042"/>
+                      <a:ext cx="5940000" cy="7448738"/>
                     </a:xfrm>
                     <a:prstGeom prst="rect">
                       <a:avLst/>
@@ -2269,7 +2323,12 @@
         <w:jc w:val="center"/>
       </w:pPr>
       <w:r>
-        <w:t xml:space="preserve">« Un investissement léger, et des gains qui se voient » : un bloc pour la mission, une pile pour ce qu’elle évite et rapporte.</w:t>
+        <w:t xml:space="preserve">Le livrable « votre client idéal » : ses centres d’intérêt en constellation, sa journée en réseau.</w:t>
+      </w:r>
+    </w:p>
+    <w:p>
+      <w:r>
+        <w:br w:type="page"/>
       </w:r>
     </w:p>
     <w:p>
@@ -2277,236 +2336,12 @@
         <w:pStyle w:val="Titre1"/>
       </w:pPr>
       <w:r>
-        <w:t xml:space="preserve">Le mouvement</w:t>
-      </w:r>
-    </w:p>
-    <w:p>
-      <w:pPr>
-        <w:pStyle w:val="Puce"/>
-        <w:numPr>
-          <w:ilvl w:val="0"/>
-          <w:numId w:val="1"/>
-        </w:numPr>
-      </w:pPr>
-      <w:r>
-        <w:rPr>
-          <w:b/>
-        </w:rPr>
-        <w:t xml:space="preserve">Tout arrive de la profondeur</w:t>
-      </w:r>
-      <w:r>
-        <w:t xml:space="preserve"> et se redresse ; rien n’entre à plat par un simple glissement.</w:t>
-      </w:r>
-    </w:p>
-    <w:p>
-      <w:pPr>
-        <w:pStyle w:val="Puce"/>
-        <w:numPr>
-          <w:ilvl w:val="0"/>
-          <w:numId w:val="1"/>
-        </w:numPr>
-      </w:pPr>
-      <w:r>
-        <w:rPr>
-          <w:b/>
-        </w:rPr>
-        <w:t xml:space="preserve">Trois entrées, pour varier :</w:t>
-      </w:r>
-      <w:r>
-        <w:t xml:space="preserve"> la profondeur, le pivot (depuis le côté, comme une porte qu’on pousse), la bascule (depuis le haut, vers l’avant).</w:t>
-      </w:r>
-    </w:p>
-    <w:p>
-      <w:pPr>
-        <w:pStyle w:val="Puce"/>
-        <w:numPr>
-          <w:ilvl w:val="0"/>
-          <w:numId w:val="1"/>
-        </w:numPr>
-      </w:pPr>
-      <w:r>
-        <w:rPr>
-          <w:b/>
-        </w:rPr>
-        <w:t xml:space="preserve">Les schémas se construisent :</w:t>
-      </w:r>
-      <w:r>
-        <w:t xml:space="preserve"> les traits se tracent, les nœuds apparaissent, un influx parcourt les liens.</w:t>
-      </w:r>
-    </w:p>
-    <w:p>
-      <w:pPr>
-        <w:pStyle w:val="Puce"/>
-        <w:numPr>
-          <w:ilvl w:val="0"/>
-          <w:numId w:val="1"/>
-        </w:numPr>
-      </w:pPr>
-      <w:r>
-        <w:rPr>
-          <w:b/>
-        </w:rPr>
-        <w:t xml:space="preserve">Les liens :</w:t>
-      </w:r>
-      <w:r>
-        <w:t xml:space="preserve"> aucun soulignement au repos. Au survol, un trait se dessine de gauche à droite, puis un fond léger monte derrière le texte ; les flèches avancent, les cartes s’inclinent en volume sous la souris.</w:t>
-      </w:r>
-    </w:p>
-    <w:p>
-      <w:pPr>
-        <w:pStyle w:val="Puce"/>
-        <w:numPr>
-          <w:ilvl w:val="0"/>
-          <w:numId w:val="1"/>
-        </w:numPr>
-      </w:pPr>
-      <w:r>
-        <w:rPr>
-          <w:b/>
-        </w:rPr>
-        <w:t xml:space="preserve">Rythme :</w:t>
-      </w:r>
-      <w:r>
-        <w:t xml:space="preserve"> 0,3 à 1,1 seconde, des courbes douces ; le mouvement suit la lecture, il ne la retarde jamais.</w:t>
-      </w:r>
-    </w:p>
-    <w:p>
-      <w:pPr>
-        <w:pStyle w:val="Puce"/>
-        <w:numPr>
-          <w:ilvl w:val="0"/>
-          <w:numId w:val="1"/>
-        </w:numPr>
-      </w:pPr>
-      <w:r>
-        <w:rPr>
-          <w:b/>
-        </w:rPr>
-        <w:t xml:space="preserve">Mouvement réduit :</w:t>
-      </w:r>
-      <w:r>
-        <w:t xml:space="preserve"> si le visiteur l’a demandé, tout reste lisible et à sa place, sans animation.</w:t>
-      </w:r>
-    </w:p>
-    <w:p>
-      <w:r>
-        <w:br w:type="page"/>
-      </w:r>
-    </w:p>
-    <w:p>
-      <w:pPr>
-        <w:pStyle w:val="Titre1"/>
-      </w:pPr>
-      <w:r>
-        <w:t xml:space="preserve">La mise en page</w:t>
-      </w:r>
-    </w:p>
-    <w:p>
-      <w:pPr>
-        <w:pStyle w:val="Puce"/>
-        <w:numPr>
-          <w:ilvl w:val="0"/>
-          <w:numId w:val="1"/>
-        </w:numPr>
-      </w:pPr>
-      <w:r>
-        <w:rPr>
-          <w:b/>
-        </w:rPr>
-        <w:t xml:space="preserve">Chaque section s’ouvre par une phrase d’amorce,</w:t>
-      </w:r>
-      <w:r>
-        <w:t xml:space="preserve"> centrée ; le détail suit dessous.</w:t>
-      </w:r>
-    </w:p>
-    <w:p>
-      <w:pPr>
-        <w:pStyle w:val="Puce"/>
-        <w:numPr>
-          <w:ilvl w:val="0"/>
-          <w:numId w:val="1"/>
-        </w:numPr>
-      </w:pPr>
-      <w:r>
-        <w:rPr>
-          <w:b/>
-        </w:rPr>
-        <w:t xml:space="preserve">Une colonne de lecture au centre</w:t>
-      </w:r>
-      <w:r>
-        <w:t xml:space="preserve"> (42 rem, soit 60 à 70 signes) ; les schémas prennent une colonne plus large (64 rem), toujours au centre.</w:t>
-      </w:r>
-    </w:p>
-    <w:p>
-      <w:pPr>
-        <w:pStyle w:val="Puce"/>
-        <w:numPr>
-          <w:ilvl w:val="0"/>
-          <w:numId w:val="1"/>
-        </w:numPr>
-      </w:pPr>
-      <w:r>
-        <w:rPr>
-          <w:b/>
-        </w:rPr>
-        <w:t xml:space="preserve">De bonnes cases</w:t>
-      </w:r>
-      <w:r>
-        <w:t xml:space="preserve"> pour ce qui se clique : cartes et tuiles, avec un bouton visible (« Entrer → »).</w:t>
-      </w:r>
-    </w:p>
-    <w:p>
-      <w:pPr>
-        <w:pStyle w:val="Puce"/>
-        <w:numPr>
-          <w:ilvl w:val="0"/>
-          <w:numId w:val="1"/>
-        </w:numPr>
-      </w:pPr>
-      <w:r>
-        <w:rPr>
-          <w:b/>
-        </w:rPr>
-        <w:t xml:space="preserve">Des espaces réguliers :</w:t>
-      </w:r>
-      <w:r>
-        <w:t xml:space="preserve"> un bloc est à égale distance de ce qui le précède et de ce qui le suit.</w:t>
-      </w:r>
-    </w:p>
-    <w:p>
-      <w:pPr>
-        <w:pStyle w:val="Puce"/>
-        <w:numPr>
-          <w:ilvl w:val="0"/>
-          <w:numId w:val="1"/>
-        </w:numPr>
-      </w:pPr>
-      <w:r>
-        <w:rPr>
-          <w:b/>
-        </w:rPr>
-        <w:t xml:space="preserve">Des bandes de couleur</w:t>
-      </w:r>
-      <w:r>
-        <w:t xml:space="preserve"> pour rythmer : un fond pâle pour ce qu’on reçoit ou ce que ça coûte, une bande indigo pour le moment fort.</w:t>
-      </w:r>
-    </w:p>
-    <w:p>
-      <w:pPr>
-        <w:pStyle w:val="Puce"/>
-        <w:numPr>
-          <w:ilvl w:val="0"/>
-          <w:numId w:val="1"/>
-        </w:numPr>
-      </w:pPr>
-      <w:r>
-        <w:rPr>
-          <w:b/>
-        </w:rPr>
-        <w:t xml:space="preserve">Le menu occupe tout l’écran,</w:t>
-      </w:r>
-      <w:r>
-        <w:t xml:space="preserve"> de haut en bas, sur téléphone comme sur ordinateur : l’en-tête s’efface quand il s’ouvre, et le menu porte sa propre croix.</w:t>
+        <w:t xml:space="preserve">Les volumes</w:t>
+      </w:r>
+    </w:p>
+    <w:p>
+      <w:r>
+        <w:t xml:space="preserve">Les chiffres et les étapes se posent en volume, en axonométrie à 30°, comme sur une maquette. Trois faces d’indigo : dessus #5B4BE6, droite #1C0CB3, gauche #130982. Un volume plein, c’est vérifié ; en fil de fer, pas encore. Les couleurs d’explication s’y posent quand elles portent un sens : ce que ça évite en corail, ce que ça rapporte en menthe.</w:t>
       </w:r>
     </w:p>
     <w:p>
@@ -2517,7 +2352,7 @@
       <w:r>
         <w:drawing>
           <wp:inline distT="0" distB="0" distL="0" distR="0">
-            <wp:extent cx="5940000" cy="4141028"/>
+            <wp:extent cx="5940000" cy="1804042"/>
             <wp:docPr id="9" name="Image 9"/>
             <wp:cNvGraphicFramePr>
               <a:graphicFrameLocks noChangeAspect="1"/>
@@ -2538,7 +2373,7 @@
                   <pic:spPr>
                     <a:xfrm>
                       <a:off x="0" y="0"/>
-                      <a:ext cx="5940000" cy="4141028"/>
+                      <a:ext cx="5940000" cy="1804042"/>
                     </a:xfrm>
                     <a:prstGeom prst="rect">
                       <a:avLst/>
@@ -2557,7 +2392,262 @@
         <w:jc w:val="center"/>
       </w:pPr>
       <w:r>
-        <w:t xml:space="preserve">La bande indigo du moment fort : le business plan, en réseau.</w:t>
+        <w:t xml:space="preserve">« Un investissement léger, et des gains qui se voient » : un bloc pour la mission, une pile pour ce qu’elle évite et rapporte.</w:t>
+      </w:r>
+    </w:p>
+    <w:p>
+      <w:pPr>
+        <w:pStyle w:val="Titre1"/>
+      </w:pPr>
+      <w:r>
+        <w:t xml:space="preserve">Le mouvement</w:t>
+      </w:r>
+    </w:p>
+    <w:p>
+      <w:pPr>
+        <w:pStyle w:val="Puce"/>
+        <w:numPr>
+          <w:ilvl w:val="0"/>
+          <w:numId w:val="1"/>
+        </w:numPr>
+      </w:pPr>
+      <w:r>
+        <w:rPr>
+          <w:b/>
+        </w:rPr>
+        <w:t xml:space="preserve">Tout arrive de la profondeur</w:t>
+      </w:r>
+      <w:r>
+        <w:t xml:space="preserve"> et se redresse ; rien n’entre à plat par un simple glissement.</w:t>
+      </w:r>
+    </w:p>
+    <w:p>
+      <w:pPr>
+        <w:pStyle w:val="Puce"/>
+        <w:numPr>
+          <w:ilvl w:val="0"/>
+          <w:numId w:val="1"/>
+        </w:numPr>
+      </w:pPr>
+      <w:r>
+        <w:rPr>
+          <w:b/>
+        </w:rPr>
+        <w:t xml:space="preserve">Trois entrées, pour varier :</w:t>
+      </w:r>
+      <w:r>
+        <w:t xml:space="preserve"> la profondeur, le pivot (depuis le côté, comme une porte qu’on pousse), la bascule (depuis le haut, vers l’avant).</w:t>
+      </w:r>
+    </w:p>
+    <w:p>
+      <w:pPr>
+        <w:pStyle w:val="Puce"/>
+        <w:numPr>
+          <w:ilvl w:val="0"/>
+          <w:numId w:val="1"/>
+        </w:numPr>
+      </w:pPr>
+      <w:r>
+        <w:rPr>
+          <w:b/>
+        </w:rPr>
+        <w:t xml:space="preserve">Les schémas se construisent :</w:t>
+      </w:r>
+      <w:r>
+        <w:t xml:space="preserve"> les traits se tracent, les nœuds apparaissent, un influx parcourt les liens.</w:t>
+      </w:r>
+    </w:p>
+    <w:p>
+      <w:pPr>
+        <w:pStyle w:val="Puce"/>
+        <w:numPr>
+          <w:ilvl w:val="0"/>
+          <w:numId w:val="1"/>
+        </w:numPr>
+      </w:pPr>
+      <w:r>
+        <w:rPr>
+          <w:b/>
+        </w:rPr>
+        <w:t xml:space="preserve">Les liens :</w:t>
+      </w:r>
+      <w:r>
+        <w:t xml:space="preserve"> aucun soulignement au repos. Au survol, un trait se dessine de gauche à droite, puis un fond léger monte derrière le texte ; les flèches avancent, les cartes s’inclinent en volume sous la souris.</w:t>
+      </w:r>
+    </w:p>
+    <w:p>
+      <w:pPr>
+        <w:pStyle w:val="Puce"/>
+        <w:numPr>
+          <w:ilvl w:val="0"/>
+          <w:numId w:val="1"/>
+        </w:numPr>
+      </w:pPr>
+      <w:r>
+        <w:rPr>
+          <w:b/>
+        </w:rPr>
+        <w:t xml:space="preserve">Rythme :</w:t>
+      </w:r>
+      <w:r>
+        <w:t xml:space="preserve"> 0,3 à 1,1 seconde, des courbes douces ; le mouvement suit la lecture, il ne la retarde jamais.</w:t>
+      </w:r>
+    </w:p>
+    <w:p>
+      <w:pPr>
+        <w:pStyle w:val="Puce"/>
+        <w:numPr>
+          <w:ilvl w:val="0"/>
+          <w:numId w:val="1"/>
+        </w:numPr>
+      </w:pPr>
+      <w:r>
+        <w:rPr>
+          <w:b/>
+        </w:rPr>
+        <w:t xml:space="preserve">Mouvement réduit :</w:t>
+      </w:r>
+      <w:r>
+        <w:t xml:space="preserve"> si le visiteur l’a demandé, tout reste lisible et à sa place, sans animation.</w:t>
+      </w:r>
+    </w:p>
+    <w:p>
+      <w:r>
+        <w:br w:type="page"/>
+      </w:r>
+    </w:p>
+    <w:p>
+      <w:pPr>
+        <w:pStyle w:val="Titre1"/>
+      </w:pPr>
+      <w:r>
+        <w:t xml:space="preserve">La mise en page</w:t>
+      </w:r>
+    </w:p>
+    <w:p>
+      <w:pPr>
+        <w:pStyle w:val="Puce"/>
+        <w:numPr>
+          <w:ilvl w:val="0"/>
+          <w:numId w:val="1"/>
+        </w:numPr>
+      </w:pPr>
+      <w:r>
+        <w:rPr>
+          <w:b/>
+        </w:rPr>
+        <w:t xml:space="preserve">Chaque section s’ouvre par une phrase d’amorce,</w:t>
+      </w:r>
+      <w:r>
+        <w:t xml:space="preserve"> centrée ; le détail suit dessous.</w:t>
+      </w:r>
+    </w:p>
+    <w:p>
+      <w:pPr>
+        <w:pStyle w:val="Puce"/>
+        <w:numPr>
+          <w:ilvl w:val="0"/>
+          <w:numId w:val="1"/>
+        </w:numPr>
+      </w:pPr>
+      <w:r>
+        <w:rPr>
+          <w:b/>
+        </w:rPr>
+        <w:t xml:space="preserve">Une colonne de lecture au centre</w:t>
+      </w:r>
+      <w:r>
+        <w:t xml:space="preserve"> (42 rem, soit 60 à 70 signes) ; les schémas prennent une colonne plus large (64 rem), toujours au centre.</w:t>
+      </w:r>
+    </w:p>
+    <w:p>
+      <w:pPr>
+        <w:pStyle w:val="Puce"/>
+        <w:numPr>
+          <w:ilvl w:val="0"/>
+          <w:numId w:val="1"/>
+        </w:numPr>
+      </w:pPr>
+      <w:r>
+        <w:rPr>
+          <w:b/>
+        </w:rPr>
+        <w:t xml:space="preserve">De bonnes cases</w:t>
+      </w:r>
+      <w:r>
+        <w:t xml:space="preserve"> pour ce qui se clique : cartes et tuiles, avec un bouton visible (« Entrer → »).</w:t>
+      </w:r>
+    </w:p>
+    <w:p>
+      <w:pPr>
+        <w:pStyle w:val="Puce"/>
+        <w:numPr>
+          <w:ilvl w:val="0"/>
+          <w:numId w:val="1"/>
+        </w:numPr>
+      </w:pPr>
+      <w:r>
+        <w:rPr>
+          <w:b/>
+        </w:rPr>
+        <w:t xml:space="preserve">Des espaces réguliers :</w:t>
+      </w:r>
+      <w:r>
+        <w:t xml:space="preserve"> un bloc est à égale distance de ce qui le précède et de ce qui le suit.</w:t>
+      </w:r>
+    </w:p>
+    <w:p>
+      <w:pPr>
+        <w:pStyle w:val="Puce"/>
+        <w:numPr>
+          <w:ilvl w:val="0"/>
+          <w:numId w:val="1"/>
+        </w:numPr>
+      </w:pPr>
+      <w:r>
+        <w:rPr>
+          <w:b/>
+        </w:rPr>
+        <w:t xml:space="preserve">Des bandes de couleur</w:t>
+      </w:r>
+      <w:r>
+        <w:t xml:space="preserve"> pour rythmer : un fond pâle pour ce qu’on reçoit ou ce que ça coûte, une bande indigo pour le moment fort.</w:t>
+      </w:r>
+    </w:p>
+    <w:p>
+      <w:pPr>
+        <w:pStyle w:val="Puce"/>
+        <w:numPr>
+          <w:ilvl w:val="0"/>
+          <w:numId w:val="1"/>
+        </w:numPr>
+      </w:pPr>
+      <w:r>
+        <w:rPr>
+          <w:b/>
+        </w:rPr>
+        <w:t xml:space="preserve">Le menu occupe tout l’écran,</w:t>
+      </w:r>
+      <w:r>
+        <w:t xml:space="preserve"> de haut en bas, sur téléphone comme sur ordinateur : l’en-tête s’efface quand il s’ouvre, et le menu porte sa propre croix.</w:t>
+      </w:r>
+    </w:p>
+    <w:p>
+      <w:pPr>
+        <w:pStyle w:val="Puce"/>
+        <w:numPr>
+          <w:ilvl w:val="0"/>
+          <w:numId w:val="1"/>
+        </w:numPr>
+      </w:pPr>
+      <w:r>
+        <w:rPr>
+          <w:b/>
+        </w:rPr>
+        <w:t xml:space="preserve">La croix parle réseau, comme le burger :</w:t>
+      </w:r>
+      <w:r>
+        <w:t xml:space="preserve"> quatre liens partis d’un nœud central, un nœud au bout de chacun. Elle se construit à l’ouverture du menu, et ses bras se resserrent au survol. Toutes les croix de fermeture du site sont celle-ci.</w:t>
       </w:r>
     </w:p>
     <w:p>
@@ -2568,7 +2658,7 @@
       <w:r>
         <w:drawing>
           <wp:inline distT="0" distB="0" distL="0" distR="0">
-            <wp:extent cx="5940000" cy="3712500"/>
+            <wp:extent cx="5940000" cy="4141028"/>
             <wp:docPr id="10" name="Image 10"/>
             <wp:cNvGraphicFramePr>
               <a:graphicFrameLocks noChangeAspect="1"/>
@@ -2582,6 +2672,57 @@
                   </pic:nvPicPr>
                   <pic:blipFill>
                     <a:blip r:embed="rIdImg10"/>
+                    <a:stretch>
+                      <a:fillRect/>
+                    </a:stretch>
+                  </pic:blipFill>
+                  <pic:spPr>
+                    <a:xfrm>
+                      <a:off x="0" y="0"/>
+                      <a:ext cx="5940000" cy="4141028"/>
+                    </a:xfrm>
+                    <a:prstGeom prst="rect">
+                      <a:avLst/>
+                    </a:prstGeom>
+                  </pic:spPr>
+                </pic:pic>
+              </a:graphicData>
+            </a:graphic>
+          </wp:inline>
+        </w:drawing>
+      </w:r>
+    </w:p>
+    <w:p>
+      <w:pPr>
+        <w:pStyle w:val="Legende"/>
+        <w:jc w:val="center"/>
+      </w:pPr>
+      <w:r>
+        <w:t xml:space="preserve">La bande indigo du moment fort : le business plan, en réseau.</w:t>
+      </w:r>
+    </w:p>
+    <w:p>
+      <w:pPr>
+        <w:spacing w:before="120" w:after="200"/>
+        <w:jc w:val="center"/>
+      </w:pPr>
+      <w:r>
+        <w:drawing>
+          <wp:inline distT="0" distB="0" distL="0" distR="0">
+            <wp:extent cx="5940000" cy="3712500"/>
+            <wp:docPr id="11" name="Image 11"/>
+            <wp:cNvGraphicFramePr>
+              <a:graphicFrameLocks noChangeAspect="1"/>
+            </wp:cNvGraphicFramePr>
+            <a:graphic>
+              <a:graphicData uri="http://schemas.openxmlformats.org/drawingml/2006/picture">
+                <pic:pic>
+                  <pic:nvPicPr>
+                    <pic:cNvPr id="11" name="image11.png"/>
+                    <pic:cNvPicPr/>
+                  </pic:nvPicPr>
+                  <pic:blipFill>
+                    <a:blip r:embed="rIdImg11"/>
                     <a:stretch>
                       <a:fillRect/>
                     </a:stretch>
@@ -3006,7 +3147,7 @@
     </w:p>
     <w:p>
       <w:r>
-        <w:t xml:space="preserve">85 × 55 mm, recto indigo (le nom, ce que la personne mène, ses coordonnées), verso crème (le R et la phrase de marque), sans filet horizontal, avec l’adresse reskope.fr. Fichiers prêts pour l’imprimeur dans « Impression / Cartes de visite ».</w:t>
+        <w:t xml:space="preserve">85 × 55 mm. Au recto, sur l’indigo : le logo horizontal en haut à gauche, exactement celui de l’en-tête ; le nom, ce que la personne mène, ses coordonnées ; un grand R en filigrane, avec la trame. Au verso, sur le crème : le R, le nom, la phrase de marque. Aucun filet horizontal, l’adresse reskope.fr. Fichiers prêts pour l’imprimeur dans « Impression / Cartes de visite ».</w:t>
       </w:r>
     </w:p>
     <w:tbl>
@@ -3034,54 +3175,6 @@
         <w:gridCol w:w="4819"/>
       </w:tblGrid>
       <w:tr>
-        <w:tc>
-          <w:tcPr>
-            <w:tcW w:w="4819" w:type="dxa"/>
-            <w:vAlign w:val="center"/>
-          </w:tcPr>
-          <w:p>
-            <w:pPr>
-              <w:spacing w:before="120" w:after="200"/>
-              <w:jc w:val="center"/>
-            </w:pPr>
-            <w:r>
-              <w:drawing>
-                <wp:inline distT="0" distB="0" distL="0" distR="0">
-                  <wp:extent cx="2916000" cy="1887848"/>
-                  <wp:docPr id="11" name="Image 11"/>
-                  <wp:cNvGraphicFramePr>
-                    <a:graphicFrameLocks noChangeAspect="1"/>
-                  </wp:cNvGraphicFramePr>
-                  <a:graphic>
-                    <a:graphicData uri="http://schemas.openxmlformats.org/drawingml/2006/picture">
-                      <pic:pic>
-                        <pic:nvPicPr>
-                          <pic:cNvPr id="11" name="image11.png"/>
-                          <pic:cNvPicPr/>
-                        </pic:nvPicPr>
-                        <pic:blipFill>
-                          <a:blip r:embed="rIdImg11"/>
-                          <a:stretch>
-                            <a:fillRect/>
-                          </a:stretch>
-                        </pic:blipFill>
-                        <pic:spPr>
-                          <a:xfrm>
-                            <a:off x="0" y="0"/>
-                            <a:ext cx="2916000" cy="1887848"/>
-                          </a:xfrm>
-                          <a:prstGeom prst="rect">
-                            <a:avLst/>
-                          </a:prstGeom>
-                        </pic:spPr>
-                      </pic:pic>
-                    </a:graphicData>
-                  </a:graphic>
-                </wp:inline>
-              </w:drawing>
-            </w:r>
-          </w:p>
-        </w:tc>
         <w:tc>
           <w:tcPr>
             <w:tcW w:w="4819" w:type="dxa"/>
@@ -3130,8 +3223,6 @@
             </w:r>
           </w:p>
         </w:tc>
-      </w:tr>
-      <w:tr>
         <w:tc>
           <w:tcPr>
             <w:tcW w:w="4819" w:type="dxa"/>
@@ -3180,6 +3271,8 @@
             </w:r>
           </w:p>
         </w:tc>
+      </w:tr>
+      <w:tr>
         <w:tc>
           <w:tcPr>
             <w:tcW w:w="4819" w:type="dxa"/>
@@ -3228,6 +3321,54 @@
             </w:r>
           </w:p>
         </w:tc>
+        <w:tc>
+          <w:tcPr>
+            <w:tcW w:w="4819" w:type="dxa"/>
+            <w:vAlign w:val="center"/>
+          </w:tcPr>
+          <w:p>
+            <w:pPr>
+              <w:spacing w:before="120" w:after="200"/>
+              <w:jc w:val="center"/>
+            </w:pPr>
+            <w:r>
+              <w:drawing>
+                <wp:inline distT="0" distB="0" distL="0" distR="0">
+                  <wp:extent cx="2916000" cy="1887848"/>
+                  <wp:docPr id="15" name="Image 15"/>
+                  <wp:cNvGraphicFramePr>
+                    <a:graphicFrameLocks noChangeAspect="1"/>
+                  </wp:cNvGraphicFramePr>
+                  <a:graphic>
+                    <a:graphicData uri="http://schemas.openxmlformats.org/drawingml/2006/picture">
+                      <pic:pic>
+                        <pic:nvPicPr>
+                          <pic:cNvPr id="15" name="image15.png"/>
+                          <pic:cNvPicPr/>
+                        </pic:nvPicPr>
+                        <pic:blipFill>
+                          <a:blip r:embed="rIdImg15"/>
+                          <a:stretch>
+                            <a:fillRect/>
+                          </a:stretch>
+                        </pic:blipFill>
+                        <pic:spPr>
+                          <a:xfrm>
+                            <a:off x="0" y="0"/>
+                            <a:ext cx="2916000" cy="1887848"/>
+                          </a:xfrm>
+                          <a:prstGeom prst="rect">
+                            <a:avLst/>
+                          </a:prstGeom>
+                        </pic:spPr>
+                      </pic:pic>
+                    </a:graphicData>
+                  </a:graphic>
+                </wp:inline>
+              </w:drawing>
+            </w:r>
+          </w:p>
+        </w:tc>
       </w:tr>
     </w:tbl>
     <w:p>
@@ -3240,12 +3381,12 @@
         <w:pStyle w:val="Titre2"/>
       </w:pPr>
       <w:r>
-        <w:t xml:space="preserve">Le site</w:t>
-      </w:r>
-    </w:p>
-    <w:p>
-      <w:r>
-        <w:t xml:space="preserve">Une entrée qui pose une seule question (« Où en est votre entreprise ? »), trois espaces, un sélecteur toujours visible à côté du logo.</w:t>
+        <w:t xml:space="preserve">L’image de partage</w:t>
+      </w:r>
+    </w:p>
+    <w:p>
+      <w:r>
+        <w:t xml:space="preserve">La vignette qui s’affiche quand on colle le lien du site sur LinkedIn ou dans un message : le logo, la phrase de marque, les trois espaces avec leurs couleurs, le grand R en filigrane.</w:t>
       </w:r>
     </w:p>
     <w:p>
@@ -3256,8 +3397,8 @@
       <w:r>
         <w:drawing>
           <wp:inline distT="0" distB="0" distL="0" distR="0">
-            <wp:extent cx="5040000" cy="382064"/>
-            <wp:docPr id="15" name="Image 15"/>
+            <wp:extent cx="5040000" cy="2646000"/>
+            <wp:docPr id="16" name="Image 16"/>
             <wp:cNvGraphicFramePr>
               <a:graphicFrameLocks noChangeAspect="1"/>
             </wp:cNvGraphicFramePr>
@@ -3265,11 +3406,66 @@
               <a:graphicData uri="http://schemas.openxmlformats.org/drawingml/2006/picture">
                 <pic:pic>
                   <pic:nvPicPr>
-                    <pic:cNvPr id="15" name="image15.png"/>
+                    <pic:cNvPr id="16" name="image16.png"/>
                     <pic:cNvPicPr/>
                   </pic:nvPicPr>
                   <pic:blipFill>
-                    <a:blip r:embed="rIdImg15"/>
+                    <a:blip r:embed="rIdImg16"/>
+                    <a:stretch>
+                      <a:fillRect/>
+                    </a:stretch>
+                  </pic:blipFill>
+                  <pic:spPr>
+                    <a:xfrm>
+                      <a:off x="0" y="0"/>
+                      <a:ext cx="5040000" cy="2646000"/>
+                    </a:xfrm>
+                    <a:prstGeom prst="rect">
+                      <a:avLst/>
+                    </a:prstGeom>
+                  </pic:spPr>
+                </pic:pic>
+              </a:graphicData>
+            </a:graphic>
+          </wp:inline>
+        </w:drawing>
+      </w:r>
+    </w:p>
+    <w:p>
+      <w:pPr>
+        <w:pStyle w:val="Titre2"/>
+      </w:pPr>
+      <w:r>
+        <w:t xml:space="preserve">Le site</w:t>
+      </w:r>
+    </w:p>
+    <w:p>
+      <w:r>
+        <w:t xml:space="preserve">Une entrée qui pose une seule question (« Où en est votre entreprise ? »), trois espaces, un sélecteur toujours visible à côté du logo.</w:t>
+      </w:r>
+    </w:p>
+    <w:p>
+      <w:pPr>
+        <w:spacing w:before="120" w:after="200"/>
+        <w:jc w:val="center"/>
+      </w:pPr>
+      <w:r>
+        <w:drawing>
+          <wp:inline distT="0" distB="0" distL="0" distR="0">
+            <wp:extent cx="5040000" cy="382064"/>
+            <wp:docPr id="17" name="Image 17"/>
+            <wp:cNvGraphicFramePr>
+              <a:graphicFrameLocks noChangeAspect="1"/>
+            </wp:cNvGraphicFramePr>
+            <a:graphic>
+              <a:graphicData uri="http://schemas.openxmlformats.org/drawingml/2006/picture">
+                <pic:pic>
+                  <pic:nvPicPr>
+                    <pic:cNvPr id="17" name="image17.png"/>
+                    <pic:cNvPicPr/>
+                  </pic:nvPicPr>
+                  <pic:blipFill>
+                    <a:blip r:embed="rIdImg17"/>
                     <a:stretch>
                       <a:fillRect/>
                     </a:stretch>
@@ -3351,7 +3547,19 @@
         </w:numPr>
       </w:pPr>
       <w:r>
-        <w:t xml:space="preserve">Déformer ou recolorer le logo.</w:t>
+        <w:t xml:space="preserve">Déformer ou recolorer le logo, ou épaissir les traits du R.</w:t>
+      </w:r>
+    </w:p>
+    <w:p>
+      <w:pPr>
+        <w:pStyle w:val="Puce"/>
+        <w:numPr>
+          <w:ilvl w:val="0"/>
+          <w:numId w:val="1"/>
+        </w:numPr>
+      </w:pPr>
+      <w:r>
+        <w:t xml:space="preserve">Dessiner une croix de fermeture sans ses nœuds : comme le burger, elle parle réseau.</w:t>
       </w:r>
     </w:p>
     <w:p>

</xml_diff>

<commit_message>
Direction artistique : le document passe à Reskope Sans
Le document de DA citait encore Neue Einstellung et montrait des visuels
faits avec elle (logo, spécimen, captures du site). Ses deux générateurs,
restés dans un brouillon de session, rejoignent le dépôt dans
scripts/direction-artistique/ : visuels.py refait les images avec les
polices maison, document.py réécrit le .docx. Les chantiers « à venir »
(films, livret, police) sont faits et décrits comme tels.

Co-Authored-By: Claude Opus 5.5 <noreply@anthropic.com>
</commit_message>
<xml_diff>
--- a/Impression/Reskope - Direction artistique.docx
+++ b/Impression/Reskope - Direction artistique.docx
@@ -64,7 +64,7 @@
         <w:jc w:val="center"/>
       </w:pPr>
       <w:r>
-        <w:t xml:space="preserve">Reskope · version du 27 septembre 2026</w:t>
+        <w:t xml:space="preserve">Reskope · version du 28 septembre 2026</w:t>
       </w:r>
     </w:p>
     <w:p>
@@ -250,7 +250,7 @@
     </w:p>
     <w:p>
       <w:r>
-        <w:t xml:space="preserve">Le R de Reskope est un réseau : six nœuds, six liens. Le nœud de jonction, au milieu du fût, est plus gros : c’est là que tout se relie. À côté, le nom en Neue Einstellung SemiBold, serré d’un cheveu (−2 %).</w:t>
+        <w:t xml:space="preserve">Le R de Reskope est un réseau : six nœuds, six liens. Le nœud de jonction, au milieu du fût, est plus gros : c’est là que tout se relie. À côté, le nom en Reskope Sans SemiBold, notre police, serré d’un cheveu (−2 %).</w:t>
       </w:r>
     </w:p>
     <w:tbl>
@@ -2031,7 +2031,7 @@
       <w:r>
         <w:drawing>
           <wp:inline distT="0" distB="0" distL="0" distR="0">
-            <wp:extent cx="5940000" cy="2509650"/>
+            <wp:extent cx="5940000" cy="2682900"/>
             <wp:docPr id="6" name="Image 6"/>
             <wp:cNvGraphicFramePr>
               <a:graphicFrameLocks noChangeAspect="1"/>
@@ -2052,7 +2052,7 @@
                   <pic:spPr>
                     <a:xfrm>
                       <a:off x="0" y="0"/>
-                      <a:ext cx="5940000" cy="2509650"/>
+                      <a:ext cx="5940000" cy="2682900"/>
                     </a:xfrm>
                     <a:prstGeom prst="rect">
                       <a:avLst/>
@@ -2077,10 +2077,10 @@
         <w:rPr>
           <w:b/>
         </w:rPr>
-        <w:t xml:space="preserve">Neue Einstellung</w:t>
-      </w:r>
-      <w:r>
-        <w:t xml:space="preserve"> pour tout le texte : Regular 400 pour lire, Medium 500 pour les liens et les étiquettes, SemiBold 600 pour les titres.</w:t>
+        <w:t xml:space="preserve">Reskope Sans</w:t>
+      </w:r>
+      <w:r>
+        <w:t xml:space="preserve"> pour tout le texte : Regular 400 pour lire, Medium 500 pour les liens et les étiquettes, SemiBold 600 pour les titres. Elle existe aussi en Light 300 et en Bold 700.</w:t>
       </w:r>
     </w:p>
     <w:p>
@@ -2146,10 +2146,10 @@
         <w:rPr>
           <w:b/>
         </w:rPr>
-        <w:t xml:space="preserve">À venir :</w:t>
-      </w:r>
-      <w:r>
-        <w:t xml:space="preserve"> une typographie maison, « Reskope ». La police Neue Einstellung n’est pas à nous ; la nôtre la remplacera partout, sur le site comme sur les supports.</w:t>
+        <w:t xml:space="preserve">Nos deux polices sont à nous.</w:t>
+      </w:r>
+      <w:r>
+        <w:t xml:space="preserve"> Reskope Sans pour le texte et Reskope Network pour les grands mots sont dessinées pour la marque : aucune licence à payer. Pour les installer dans Word, Pages ou Canva, les fichiers sont dans le dossier « Typographie Sans » du projet.</w:t>
       </w:r>
     </w:p>
     <w:p>
@@ -2232,7 +2232,7 @@
       <w:r>
         <w:drawing>
           <wp:inline distT="0" distB="0" distL="0" distR="0">
-            <wp:extent cx="5940000" cy="4445419"/>
+            <wp:extent cx="5940000" cy="4541225"/>
             <wp:docPr id="7" name="Image 7"/>
             <wp:cNvGraphicFramePr>
               <a:graphicFrameLocks noChangeAspect="1"/>
@@ -2253,7 +2253,7 @@
                   <pic:spPr>
                     <a:xfrm>
                       <a:off x="0" y="0"/>
-                      <a:ext cx="5940000" cy="4445419"/>
+                      <a:ext cx="5940000" cy="4541225"/>
                     </a:xfrm>
                     <a:prstGeom prst="rect">
                       <a:avLst/>
@@ -2283,7 +2283,7 @@
       <w:r>
         <w:drawing>
           <wp:inline distT="0" distB="0" distL="0" distR="0">
-            <wp:extent cx="5940000" cy="7448738"/>
+            <wp:extent cx="5940000" cy="7733605"/>
             <wp:docPr id="8" name="Image 8"/>
             <wp:cNvGraphicFramePr>
               <a:graphicFrameLocks noChangeAspect="1"/>
@@ -2304,7 +2304,7 @@
                   <pic:spPr>
                     <a:xfrm>
                       <a:off x="0" y="0"/>
-                      <a:ext cx="5940000" cy="7448738"/>
+                      <a:ext cx="5940000" cy="7733605"/>
                     </a:xfrm>
                     <a:prstGeom prst="rect">
                       <a:avLst/>
@@ -2352,7 +2352,7 @@
       <w:r>
         <w:drawing>
           <wp:inline distT="0" distB="0" distL="0" distR="0">
-            <wp:extent cx="5940000" cy="1804042"/>
+            <wp:extent cx="5940000" cy="1809843"/>
             <wp:docPr id="9" name="Image 9"/>
             <wp:cNvGraphicFramePr>
               <a:graphicFrameLocks noChangeAspect="1"/>
@@ -2373,7 +2373,7 @@
                   <pic:spPr>
                     <a:xfrm>
                       <a:off x="0" y="0"/>
-                      <a:ext cx="5940000" cy="1804042"/>
+                      <a:ext cx="5940000" cy="1809843"/>
                     </a:xfrm>
                     <a:prstGeom prst="rect">
                       <a:avLst/>
@@ -3491,43 +3491,25 @@
         <w:pStyle w:val="Titre2"/>
       </w:pPr>
       <w:r>
-        <w:t xml:space="preserve">À venir</w:t>
-      </w:r>
-    </w:p>
-    <w:p>
-      <w:pPr>
-        <w:pStyle w:val="Puce"/>
-        <w:numPr>
-          <w:ilvl w:val="0"/>
-          <w:numId w:val="1"/>
-        </w:numPr>
-      </w:pPr>
-      <w:r>
-        <w:t xml:space="preserve">Le motion design de la marque.</w:t>
-      </w:r>
-    </w:p>
-    <w:p>
-      <w:pPr>
-        <w:pStyle w:val="Puce"/>
-        <w:numPr>
-          <w:ilvl w:val="0"/>
-          <w:numId w:val="1"/>
-        </w:numPr>
-      </w:pPr>
-      <w:r>
-        <w:t xml:space="preserve">Le livret imprimé, mis à jour.</w:t>
-      </w:r>
-    </w:p>
-    <w:p>
-      <w:pPr>
-        <w:pStyle w:val="Puce"/>
-        <w:numPr>
-          <w:ilvl w:val="0"/>
-          <w:numId w:val="1"/>
-        </w:numPr>
-      </w:pPr>
-      <w:r>
-        <w:t xml:space="preserve">La typographie maison « Reskope ».</w:t>
+        <w:t xml:space="preserve">Le livret</w:t>
+      </w:r>
+    </w:p>
+    <w:p>
+      <w:r>
+        <w:t xml:space="preserve">Un livret complet de 20 pages et un livret de 8 pages par espace, en A4 : la bande sable en bas de page, les cadres à nœuds et les volumes du site. Ils se régénèrent à partir des données du site, dans « Impression / Livrets ».</w:t>
+      </w:r>
+    </w:p>
+    <w:p>
+      <w:pPr>
+        <w:pStyle w:val="Titre2"/>
+      </w:pPr>
+      <w:r>
+        <w:t xml:space="preserve">Les films</w:t>
+      </w:r>
+    </w:p>
+    <w:p>
+      <w:r>
+        <w:t xml:space="preserve">Trois films verticaux de 24 à 26 secondes, un par espace, en vraie 3D et avec leur musique originale, en 9:16 et en 4:5, prêts à poster. Chacun finit sur le logo, la phrase de marque et reskope.fr.</w:t>
       </w:r>
     </w:p>
     <w:p>

</xml_diff>